<commit_message>
premier essai gestion des doc word en 3 langues
</commit_message>
<xml_diff>
--- a/Rapports_mensuels/Mois2026_01/ipc_note_08_ang_2026_01.docx
+++ b/Rapports_mensuels/Mois2026_01/ipc_note_08_ang_2026_01.docx
@@ -1079,7 +1079,7 @@
                 <w:szCs w:val="16"/>
                 <w:color w:val="000000"/>
               </w:rPr>
-              <w:t xml:space="preserve">39,009</w:t>
+              <w:t xml:space="preserve">40,725</w:t>
             </w:r>
           </w:p>
         </w:tc>
@@ -1133,7 +1133,7 @@
                 <w:szCs w:val="16"/>
                 <w:color w:val="000000"/>
               </w:rPr>
-              <w:t xml:space="preserve">132,1</w:t>
+              <w:t xml:space="preserve">133,7</w:t>
             </w:r>
           </w:p>
         </w:tc>
@@ -1187,7 +1187,7 @@
                 <w:szCs w:val="16"/>
                 <w:color w:val="000000"/>
               </w:rPr>
-              <w:t xml:space="preserve">130,3</w:t>
+              <w:t xml:space="preserve">131,8</w:t>
             </w:r>
           </w:p>
         </w:tc>
@@ -1241,7 +1241,7 @@
                 <w:szCs w:val="16"/>
                 <w:color w:val="000000"/>
               </w:rPr>
-              <w:t xml:space="preserve">128,6</w:t>
+              <w:t xml:space="preserve">130,5</w:t>
             </w:r>
           </w:p>
         </w:tc>
@@ -1295,7 +1295,7 @@
                 <w:szCs w:val="16"/>
                 <w:color w:val="000000"/>
               </w:rPr>
-              <w:t xml:space="preserve">128,2</w:t>
+              <w:t xml:space="preserve">130,1</w:t>
             </w:r>
           </w:p>
         </w:tc>
@@ -1349,7 +1349,7 @@
                 <w:szCs w:val="16"/>
                 <w:color w:val="000000"/>
               </w:rPr>
-              <w:t xml:space="preserve">129,2</w:t>
+              <w:t xml:space="preserve">131,4</w:t>
             </w:r>
           </w:p>
         </w:tc>
@@ -1403,7 +1403,7 @@
                 <w:szCs w:val="16"/>
                 <w:color w:val="000000"/>
               </w:rPr>
-              <w:t xml:space="preserve">0,8</w:t>
+              <w:t xml:space="preserve">1,0</w:t>
             </w:r>
           </w:p>
         </w:tc>
@@ -1457,7 +1457,7 @@
                 <w:szCs w:val="16"/>
                 <w:color w:val="000000"/>
               </w:rPr>
-              <w:t xml:space="preserve">-0,8</w:t>
+              <w:t xml:space="preserve">-0,3</w:t>
             </w:r>
           </w:p>
         </w:tc>
@@ -1511,7 +1511,7 @@
                 <w:szCs w:val="16"/>
                 <w:color w:val="000000"/>
               </w:rPr>
-              <w:t xml:space="preserve">-2,2</w:t>
+              <w:t xml:space="preserve">-1,7</w:t>
             </w:r>
           </w:p>
         </w:tc>
@@ -1625,7 +1625,7 @@
                 <w:szCs w:val="16"/>
                 <w:color w:val="000000"/>
               </w:rPr>
-              <w:t xml:space="preserve">37,502</w:t>
+              <w:t xml:space="preserve">38,964</w:t>
             </w:r>
           </w:p>
         </w:tc>
@@ -1679,7 +1679,7 @@
                 <w:szCs w:val="16"/>
                 <w:color w:val="000000"/>
               </w:rPr>
-              <w:t xml:space="preserve">131,6</w:t>
+              <w:t xml:space="preserve">133,2</w:t>
             </w:r>
           </w:p>
         </w:tc>
@@ -1733,7 +1733,7 @@
                 <w:szCs w:val="16"/>
                 <w:color w:val="000000"/>
               </w:rPr>
-              <w:t xml:space="preserve">129,7</w:t>
+              <w:t xml:space="preserve">131,2</w:t>
             </w:r>
           </w:p>
         </w:tc>
@@ -1787,7 +1787,7 @@
                 <w:szCs w:val="16"/>
                 <w:color w:val="000000"/>
               </w:rPr>
-              <w:t xml:space="preserve">127,9</w:t>
+              <w:t xml:space="preserve">129,8</w:t>
             </w:r>
           </w:p>
         </w:tc>
@@ -1841,7 +1841,7 @@
                 <w:szCs w:val="16"/>
                 <w:color w:val="000000"/>
               </w:rPr>
-              <w:t xml:space="preserve">127,5</w:t>
+              <w:t xml:space="preserve">129,4</w:t>
             </w:r>
           </w:p>
         </w:tc>
@@ -1895,7 +1895,7 @@
                 <w:szCs w:val="16"/>
                 <w:color w:val="000000"/>
               </w:rPr>
-              <w:t xml:space="preserve">128,4</w:t>
+              <w:t xml:space="preserve">130,5</w:t>
             </w:r>
           </w:p>
         </w:tc>
@@ -1949,7 +1949,7 @@
                 <w:szCs w:val="16"/>
                 <w:color w:val="000000"/>
               </w:rPr>
-              <w:t xml:space="preserve">0,7</w:t>
+              <w:t xml:space="preserve">0,9</w:t>
             </w:r>
           </w:p>
         </w:tc>
@@ -2003,7 +2003,7 @@
                 <w:szCs w:val="16"/>
                 <w:color w:val="000000"/>
               </w:rPr>
-              <w:t xml:space="preserve">-1,0</w:t>
+              <w:t xml:space="preserve">-0,5</w:t>
             </w:r>
           </w:p>
         </w:tc>
@@ -2057,7 +2057,7 @@
                 <w:szCs w:val="16"/>
                 <w:color w:val="000000"/>
               </w:rPr>
-              <w:t xml:space="preserve">-2,4</w:t>
+              <w:t xml:space="preserve">-2,0</w:t>
             </w:r>
           </w:p>
         </w:tc>
@@ -2171,7 +2171,7 @@
                 <w:szCs w:val="16"/>
                 <w:color w:val="000000"/>
               </w:rPr>
-              <w:t xml:space="preserve">1,507</w:t>
+              <w:t xml:space="preserve">1,761</w:t>
             </w:r>
           </w:p>
         </w:tc>
@@ -2225,7 +2225,7 @@
                 <w:szCs w:val="16"/>
                 <w:color w:val="000000"/>
               </w:rPr>
-              <w:t xml:space="preserve">144,0</w:t>
+              <w:t xml:space="preserve">145,1</w:t>
             </w:r>
           </w:p>
         </w:tc>
@@ -2279,7 +2279,7 @@
                 <w:szCs w:val="16"/>
                 <w:color w:val="000000"/>
               </w:rPr>
-              <w:t xml:space="preserve">145,0</w:t>
+              <w:t xml:space="preserve">146,1</w:t>
             </w:r>
           </w:p>
         </w:tc>
@@ -2333,7 +2333,7 @@
                 <w:szCs w:val="16"/>
                 <w:color w:val="000000"/>
               </w:rPr>
-              <w:t xml:space="preserve">145,0</w:t>
+              <w:t xml:space="preserve">146,1</w:t>
             </w:r>
           </w:p>
         </w:tc>
@@ -2387,7 +2387,7 @@
                 <w:szCs w:val="16"/>
                 <w:color w:val="000000"/>
               </w:rPr>
-              <w:t xml:space="preserve">145,0</w:t>
+              <w:t xml:space="preserve">146,1</w:t>
             </w:r>
           </w:p>
         </w:tc>
@@ -2441,7 +2441,7 @@
                 <w:szCs w:val="16"/>
                 <w:color w:val="000000"/>
               </w:rPr>
-              <w:t xml:space="preserve">149,3</w:t>
+              <w:t xml:space="preserve">150,5</w:t>
             </w:r>
           </w:p>
         </w:tc>
@@ -2717,7 +2717,7 @@
                 <w:szCs w:val="16"/>
                 <w:color w:val="000000"/>
               </w:rPr>
-              <w:t xml:space="preserve">60,991</w:t>
+              <w:t xml:space="preserve">59,275</w:t>
             </w:r>
           </w:p>
         </w:tc>
@@ -2771,7 +2771,7 @@
                 <w:szCs w:val="16"/>
                 <w:color w:val="000000"/>
               </w:rPr>
-              <w:t xml:space="preserve">112,0</w:t>
+              <w:t xml:space="preserve">110,7</w:t>
             </w:r>
           </w:p>
         </w:tc>
@@ -2825,7 +2825,7 @@
                 <w:szCs w:val="16"/>
                 <w:color w:val="000000"/>
               </w:rPr>
-              <w:t xml:space="preserve">112,5</w:t>
+              <w:t xml:space="preserve">112,1</w:t>
             </w:r>
           </w:p>
         </w:tc>
@@ -2879,7 +2879,7 @@
                 <w:szCs w:val="16"/>
                 <w:color w:val="000000"/>
               </w:rPr>
-              <w:t xml:space="preserve">112,5</w:t>
+              <w:t xml:space="preserve">112,2</w:t>
             </w:r>
           </w:p>
         </w:tc>
@@ -2933,7 +2933,7 @@
                 <w:szCs w:val="16"/>
                 <w:color w:val="000000"/>
               </w:rPr>
-              <w:t xml:space="preserve">112,6</w:t>
+              <w:t xml:space="preserve">112,3</w:t>
             </w:r>
           </w:p>
         </w:tc>
@@ -2987,7 +2987,7 @@
                 <w:szCs w:val="16"/>
                 <w:color w:val="000000"/>
               </w:rPr>
-              <w:t xml:space="preserve">112,4</w:t>
+              <w:t xml:space="preserve">112,1</w:t>
             </w:r>
           </w:p>
         </w:tc>
@@ -3095,7 +3095,7 @@
                 <w:szCs w:val="16"/>
                 <w:color w:val="000000"/>
               </w:rPr>
-              <w:t xml:space="preserve">-0,1</w:t>
+              <w:t xml:space="preserve">0,0</w:t>
             </w:r>
           </w:p>
         </w:tc>
@@ -3149,7 +3149,7 @@
                 <w:szCs w:val="16"/>
                 <w:color w:val="000000"/>
               </w:rPr>
-              <w:t xml:space="preserve">0,4</w:t>
+              <w:t xml:space="preserve">1,3</w:t>
             </w:r>
           </w:p>
         </w:tc>
@@ -3263,7 +3263,7 @@
                 <w:szCs w:val="16"/>
                 <w:color w:val="000000"/>
               </w:rPr>
-              <w:t xml:space="preserve">4,323</w:t>
+              <w:t xml:space="preserve">5,835</w:t>
             </w:r>
           </w:p>
         </w:tc>
@@ -3317,7 +3317,7 @@
                 <w:szCs w:val="16"/>
                 <w:color w:val="000000"/>
               </w:rPr>
-              <w:t xml:space="preserve">116,4</w:t>
+              <w:t xml:space="preserve">112,2</w:t>
             </w:r>
           </w:p>
         </w:tc>
@@ -3371,7 +3371,7 @@
                 <w:szCs w:val="16"/>
                 <w:color w:val="000000"/>
               </w:rPr>
-              <w:t xml:space="preserve">117,6</w:t>
+              <w:t xml:space="preserve">113,3</w:t>
             </w:r>
           </w:p>
         </w:tc>
@@ -3425,7 +3425,7 @@
                 <w:szCs w:val="16"/>
                 <w:color w:val="000000"/>
               </w:rPr>
-              <w:t xml:space="preserve">117,4</w:t>
+              <w:t xml:space="preserve">113,9</w:t>
             </w:r>
           </w:p>
         </w:tc>
@@ -3479,7 +3479,7 @@
                 <w:szCs w:val="16"/>
                 <w:color w:val="000000"/>
               </w:rPr>
-              <w:t xml:space="preserve">117,5</w:t>
+              <w:t xml:space="preserve">114,3</w:t>
             </w:r>
           </w:p>
         </w:tc>
@@ -3533,7 +3533,7 @@
                 <w:szCs w:val="16"/>
                 <w:color w:val="000000"/>
               </w:rPr>
-              <w:t xml:space="preserve">117,5</w:t>
+              <w:t xml:space="preserve">114,5</w:t>
             </w:r>
           </w:p>
         </w:tc>
@@ -3587,7 +3587,7 @@
                 <w:szCs w:val="16"/>
                 <w:color w:val="000000"/>
               </w:rPr>
-              <w:t xml:space="preserve">0,0</w:t>
+              <w:t xml:space="preserve">0,2</w:t>
             </w:r>
           </w:p>
         </w:tc>
@@ -3641,7 +3641,7 @@
                 <w:szCs w:val="16"/>
                 <w:color w:val="000000"/>
               </w:rPr>
-              <w:t xml:space="preserve">-0,1</w:t>
+              <w:t xml:space="preserve">1,1</w:t>
             </w:r>
           </w:p>
         </w:tc>
@@ -3695,7 +3695,7 @@
                 <w:szCs w:val="16"/>
                 <w:color w:val="000000"/>
               </w:rPr>
-              <w:t xml:space="preserve">0,9</w:t>
+              <w:t xml:space="preserve">2,0</w:t>
             </w:r>
           </w:p>
         </w:tc>
@@ -3809,7 +3809,7 @@
                 <w:szCs w:val="16"/>
                 <w:color w:val="000000"/>
               </w:rPr>
-              <w:t xml:space="preserve">14,575</w:t>
+              <w:t xml:space="preserve">14,202</w:t>
             </w:r>
           </w:p>
         </w:tc>
@@ -3863,7 +3863,7 @@
                 <w:szCs w:val="16"/>
                 <w:color w:val="000000"/>
               </w:rPr>
-              <w:t xml:space="preserve">108,9</w:t>
+              <w:t xml:space="preserve">108,7</w:t>
             </w:r>
           </w:p>
         </w:tc>
@@ -3917,7 +3917,7 @@
                 <w:szCs w:val="16"/>
                 <w:color w:val="000000"/>
               </w:rPr>
-              <w:t xml:space="preserve">109,5</w:t>
+              <w:t xml:space="preserve">109,4</w:t>
             </w:r>
           </w:p>
         </w:tc>
@@ -3971,7 +3971,7 @@
                 <w:szCs w:val="16"/>
                 <w:color w:val="000000"/>
               </w:rPr>
-              <w:t xml:space="preserve">109,5</w:t>
+              <w:t xml:space="preserve">109,4</w:t>
             </w:r>
           </w:p>
         </w:tc>
@@ -4025,7 +4025,7 @@
                 <w:szCs w:val="16"/>
                 <w:color w:val="000000"/>
               </w:rPr>
-              <w:t xml:space="preserve">109,6</w:t>
+              <w:t xml:space="preserve">109,4</w:t>
             </w:r>
           </w:p>
         </w:tc>
@@ -4079,7 +4079,7 @@
                 <w:szCs w:val="16"/>
                 <w:color w:val="000000"/>
               </w:rPr>
-              <w:t xml:space="preserve">109,6</w:t>
+              <w:t xml:space="preserve">109,5</w:t>
             </w:r>
           </w:p>
         </w:tc>
@@ -4133,7 +4133,7 @@
                 <w:szCs w:val="16"/>
                 <w:color w:val="000000"/>
               </w:rPr>
-              <w:t xml:space="preserve">0,0</w:t>
+              <w:t xml:space="preserve">0,1</w:t>
             </w:r>
           </w:p>
         </w:tc>
@@ -4241,7 +4241,7 @@
                 <w:szCs w:val="16"/>
                 <w:color w:val="000000"/>
               </w:rPr>
-              <w:t xml:space="preserve">0,6</w:t>
+              <w:t xml:space="preserve">0,7</w:t>
             </w:r>
           </w:p>
         </w:tc>
@@ -4355,7 +4355,7 @@
                 <w:szCs w:val="16"/>
                 <w:color w:val="000000"/>
               </w:rPr>
-              <w:t xml:space="preserve">4,407</w:t>
+              <w:t xml:space="preserve">5,602</w:t>
             </w:r>
           </w:p>
         </w:tc>
@@ -4409,7 +4409,7 @@
                 <w:szCs w:val="16"/>
                 <w:color w:val="000000"/>
               </w:rPr>
-              <w:t xml:space="preserve">112,3</w:t>
+              <w:t xml:space="preserve">110,0</w:t>
             </w:r>
           </w:p>
         </w:tc>
@@ -4463,7 +4463,7 @@
                 <w:szCs w:val="16"/>
                 <w:color w:val="000000"/>
               </w:rPr>
-              <w:t xml:space="preserve">113,0</w:t>
+              <w:t xml:space="preserve">111,2</w:t>
             </w:r>
           </w:p>
         </w:tc>
@@ -4517,7 +4517,7 @@
                 <w:szCs w:val="16"/>
                 <w:color w:val="000000"/>
               </w:rPr>
-              <w:t xml:space="preserve">113,1</w:t>
+              <w:t xml:space="preserve">111,3</w:t>
             </w:r>
           </w:p>
         </w:tc>
@@ -4571,7 +4571,7 @@
                 <w:szCs w:val="16"/>
                 <w:color w:val="000000"/>
               </w:rPr>
-              <w:t xml:space="preserve">113,2</w:t>
+              <w:t xml:space="preserve">111,5</w:t>
             </w:r>
           </w:p>
         </w:tc>
@@ -4625,7 +4625,7 @@
                 <w:szCs w:val="16"/>
                 <w:color w:val="000000"/>
               </w:rPr>
-              <w:t xml:space="preserve">113,2</w:t>
+              <w:t xml:space="preserve">112,1</w:t>
             </w:r>
           </w:p>
         </w:tc>
@@ -4679,7 +4679,7 @@
                 <w:szCs w:val="16"/>
                 <w:color w:val="000000"/>
               </w:rPr>
-              <w:t xml:space="preserve">0,0</w:t>
+              <w:t xml:space="preserve">0,5</w:t>
             </w:r>
           </w:p>
         </w:tc>
@@ -4733,7 +4733,7 @@
                 <w:szCs w:val="16"/>
                 <w:color w:val="000000"/>
               </w:rPr>
-              <w:t xml:space="preserve">0,2</w:t>
+              <w:t xml:space="preserve">0,8</w:t>
             </w:r>
           </w:p>
         </w:tc>
@@ -4787,7 +4787,7 @@
                 <w:szCs w:val="16"/>
                 <w:color w:val="000000"/>
               </w:rPr>
-              <w:t xml:space="preserve">0,8</w:t>
+              <w:t xml:space="preserve">1,9</w:t>
             </w:r>
           </w:p>
         </w:tc>
@@ -4901,7 +4901,7 @@
                 <w:szCs w:val="16"/>
                 <w:color w:val="000000"/>
               </w:rPr>
-              <w:t xml:space="preserve">7,741</w:t>
+              <w:t xml:space="preserve">6,594</w:t>
             </w:r>
           </w:p>
         </w:tc>
@@ -4955,7 +4955,7 @@
                 <w:szCs w:val="16"/>
                 <w:color w:val="000000"/>
               </w:rPr>
-              <w:t xml:space="preserve">101,2</w:t>
+              <w:t xml:space="preserve">103,0</w:t>
             </w:r>
           </w:p>
         </w:tc>
@@ -5009,7 +5009,7 @@
                 <w:szCs w:val="16"/>
                 <w:color w:val="000000"/>
               </w:rPr>
-              <w:t xml:space="preserve">101,5</w:t>
+              <w:t xml:space="preserve">103,5</w:t>
             </w:r>
           </w:p>
         </w:tc>
@@ -5063,7 +5063,7 @@
                 <w:szCs w:val="16"/>
                 <w:color w:val="000000"/>
               </w:rPr>
-              <w:t xml:space="preserve">101,5</w:t>
+              <w:t xml:space="preserve">103,5</w:t>
             </w:r>
           </w:p>
         </w:tc>
@@ -5117,7 +5117,7 @@
                 <w:szCs w:val="16"/>
                 <w:color w:val="000000"/>
               </w:rPr>
-              <w:t xml:space="preserve">101,5</w:t>
+              <w:t xml:space="preserve">103,5</w:t>
             </w:r>
           </w:p>
         </w:tc>
@@ -5171,7 +5171,7 @@
                 <w:szCs w:val="16"/>
                 <w:color w:val="000000"/>
               </w:rPr>
-              <w:t xml:space="preserve">101,5</w:t>
+              <w:t xml:space="preserve">103,5</w:t>
             </w:r>
           </w:p>
         </w:tc>
@@ -5333,7 +5333,7 @@
                 <w:szCs w:val="16"/>
                 <w:color w:val="000000"/>
               </w:rPr>
-              <w:t xml:space="preserve">0,3</w:t>
+              <w:t xml:space="preserve">0,5</w:t>
             </w:r>
           </w:p>
         </w:tc>
@@ -5447,7 +5447,7 @@
                 <w:szCs w:val="16"/>
                 <w:color w:val="000000"/>
               </w:rPr>
-              <w:t xml:space="preserve">10,040</w:t>
+              <w:t xml:space="preserve">7,416</w:t>
             </w:r>
           </w:p>
         </w:tc>
@@ -5501,7 +5501,7 @@
                 <w:szCs w:val="16"/>
                 <w:color w:val="000000"/>
               </w:rPr>
-              <w:t xml:space="preserve">117,3</w:t>
+              <w:t xml:space="preserve">113,5</w:t>
             </w:r>
           </w:p>
         </w:tc>
@@ -5555,7 +5555,7 @@
                 <w:szCs w:val="16"/>
                 <w:color w:val="000000"/>
               </w:rPr>
-              <w:t xml:space="preserve">115,9</w:t>
+              <w:t xml:space="preserve">111,3</w:t>
             </w:r>
           </w:p>
         </w:tc>
@@ -5609,7 +5609,7 @@
                 <w:szCs w:val="16"/>
                 <w:color w:val="000000"/>
               </w:rPr>
-              <w:t xml:space="preserve">115,8</w:t>
+              <w:t xml:space="preserve">111,4</w:t>
             </w:r>
           </w:p>
         </w:tc>
@@ -5663,7 +5663,7 @@
                 <w:szCs w:val="16"/>
                 <w:color w:val="000000"/>
               </w:rPr>
-              <w:t xml:space="preserve">115,7</w:t>
+              <w:t xml:space="preserve">111,2</w:t>
             </w:r>
           </w:p>
         </w:tc>
@@ -5717,7 +5717,7 @@
                 <w:szCs w:val="16"/>
                 <w:color w:val="000000"/>
               </w:rPr>
-              <w:t xml:space="preserve">113,9</w:t>
+              <w:t xml:space="preserve">108,1</w:t>
             </w:r>
           </w:p>
         </w:tc>
@@ -5771,7 +5771,7 @@
                 <w:szCs w:val="16"/>
                 <w:color w:val="000000"/>
               </w:rPr>
-              <w:t xml:space="preserve">-1,6</w:t>
+              <w:t xml:space="preserve">-2,8</w:t>
             </w:r>
           </w:p>
         </w:tc>
@@ -5825,7 +5825,7 @@
                 <w:szCs w:val="16"/>
                 <w:color w:val="000000"/>
               </w:rPr>
-              <w:t xml:space="preserve">-1,7</w:t>
+              <w:t xml:space="preserve">-2,9</w:t>
             </w:r>
           </w:p>
         </w:tc>
@@ -5879,7 +5879,7 @@
                 <w:szCs w:val="16"/>
                 <w:color w:val="000000"/>
               </w:rPr>
-              <w:t xml:space="preserve">-2,9</w:t>
+              <w:t xml:space="preserve">-4,8</w:t>
             </w:r>
           </w:p>
         </w:tc>
@@ -5993,7 +5993,7 @@
                 <w:szCs w:val="16"/>
                 <w:color w:val="000000"/>
               </w:rPr>
-              <w:t xml:space="preserve">2,958</w:t>
+              <w:t xml:space="preserve">2,560</w:t>
             </w:r>
           </w:p>
         </w:tc>
@@ -6047,7 +6047,7 @@
                 <w:szCs w:val="16"/>
                 <w:color w:val="000000"/>
               </w:rPr>
-              <w:t xml:space="preserve">104,1</w:t>
+              <w:t xml:space="preserve">98,0</w:t>
             </w:r>
           </w:p>
         </w:tc>
@@ -6101,7 +6101,7 @@
                 <w:szCs w:val="16"/>
                 <w:color w:val="000000"/>
               </w:rPr>
-              <w:t xml:space="preserve">103,8</w:t>
+              <w:t xml:space="preserve">97,2</w:t>
             </w:r>
           </w:p>
         </w:tc>
@@ -6155,7 +6155,7 @@
                 <w:szCs w:val="16"/>
                 <w:color w:val="000000"/>
               </w:rPr>
-              <w:t xml:space="preserve">103,8</w:t>
+              <w:t xml:space="preserve">97,2</w:t>
             </w:r>
           </w:p>
         </w:tc>
@@ -6209,7 +6209,7 @@
                 <w:szCs w:val="16"/>
                 <w:color w:val="000000"/>
               </w:rPr>
-              <w:t xml:space="preserve">103,8</w:t>
+              <w:t xml:space="preserve">97,1</w:t>
             </w:r>
           </w:p>
         </w:tc>
@@ -6263,7 +6263,7 @@
                 <w:szCs w:val="16"/>
                 <w:color w:val="000000"/>
               </w:rPr>
-              <w:t xml:space="preserve">103,7</w:t>
+              <w:t xml:space="preserve">97,1</w:t>
             </w:r>
           </w:p>
         </w:tc>
@@ -6317,7 +6317,7 @@
                 <w:szCs w:val="16"/>
                 <w:color w:val="000000"/>
               </w:rPr>
-              <w:t xml:space="preserve">-0,1</w:t>
+              <w:t xml:space="preserve">0,0</w:t>
             </w:r>
           </w:p>
         </w:tc>
@@ -6425,7 +6425,7 @@
                 <w:szCs w:val="16"/>
                 <w:color w:val="000000"/>
               </w:rPr>
-              <w:t xml:space="preserve">-0,4</w:t>
+              <w:t xml:space="preserve">-0,9</w:t>
             </w:r>
           </w:p>
         </w:tc>
@@ -6539,7 +6539,7 @@
                 <w:szCs w:val="16"/>
                 <w:color w:val="000000"/>
               </w:rPr>
-              <w:t xml:space="preserve">2,735</w:t>
+              <w:t xml:space="preserve">2,432</w:t>
             </w:r>
           </w:p>
         </w:tc>
@@ -6593,7 +6593,7 @@
                 <w:szCs w:val="16"/>
                 <w:color w:val="000000"/>
               </w:rPr>
-              <w:t xml:space="preserve">105,3</w:t>
+              <w:t xml:space="preserve">106,1</w:t>
             </w:r>
           </w:p>
         </w:tc>
@@ -6647,7 +6647,7 @@
                 <w:szCs w:val="16"/>
                 <w:color w:val="000000"/>
               </w:rPr>
-              <w:t xml:space="preserve">105,0</w:t>
+              <w:t xml:space="preserve">106,5</w:t>
             </w:r>
           </w:p>
         </w:tc>
@@ -6701,7 +6701,7 @@
                 <w:szCs w:val="16"/>
                 <w:color w:val="000000"/>
               </w:rPr>
-              <w:t xml:space="preserve">104,9</w:t>
+              <w:t xml:space="preserve">106,5</w:t>
             </w:r>
           </w:p>
         </w:tc>
@@ -6755,7 +6755,7 @@
                 <w:szCs w:val="16"/>
                 <w:color w:val="000000"/>
               </w:rPr>
-              <w:t xml:space="preserve">104,9</w:t>
+              <w:t xml:space="preserve">106,4</w:t>
             </w:r>
           </w:p>
         </w:tc>
@@ -6809,7 +6809,7 @@
                 <w:szCs w:val="16"/>
                 <w:color w:val="000000"/>
               </w:rPr>
-              <w:t xml:space="preserve">104,9</w:t>
+              <w:t xml:space="preserve">106,4</w:t>
             </w:r>
           </w:p>
         </w:tc>
@@ -6971,7 +6971,7 @@
                 <w:szCs w:val="16"/>
                 <w:color w:val="000000"/>
               </w:rPr>
-              <w:t xml:space="preserve">-0,4</w:t>
+              <w:t xml:space="preserve">0,3</w:t>
             </w:r>
           </w:p>
         </w:tc>
@@ -7085,7 +7085,7 @@
                 <w:szCs w:val="16"/>
                 <w:color w:val="000000"/>
               </w:rPr>
-              <w:t xml:space="preserve">5,636</w:t>
+              <w:t xml:space="preserve">5,358</w:t>
             </w:r>
           </w:p>
         </w:tc>
@@ -7139,7 +7139,7 @@
                 <w:szCs w:val="16"/>
                 <w:color w:val="000000"/>
               </w:rPr>
-              <w:t xml:space="preserve">121,8</w:t>
+              <w:t xml:space="preserve">116,8</w:t>
             </w:r>
           </w:p>
         </w:tc>
@@ -7193,7 +7193,7 @@
                 <w:szCs w:val="16"/>
                 <w:color w:val="000000"/>
               </w:rPr>
-              <w:t xml:space="preserve">124,4</w:t>
+              <w:t xml:space="preserve">128,6</w:t>
             </w:r>
           </w:p>
         </w:tc>
@@ -7247,7 +7247,7 @@
                 <w:szCs w:val="16"/>
                 <w:color w:val="000000"/>
               </w:rPr>
-              <w:t xml:space="preserve">124,4</w:t>
+              <w:t xml:space="preserve">129,5</w:t>
             </w:r>
           </w:p>
         </w:tc>
@@ -7301,7 +7301,7 @@
                 <w:szCs w:val="16"/>
                 <w:color w:val="000000"/>
               </w:rPr>
-              <w:t xml:space="preserve">124,4</w:t>
+              <w:t xml:space="preserve">129,5</w:t>
             </w:r>
           </w:p>
         </w:tc>
@@ -7355,7 +7355,7 @@
                 <w:szCs w:val="16"/>
                 <w:color w:val="000000"/>
               </w:rPr>
-              <w:t xml:space="preserve">124,4</w:t>
+              <w:t xml:space="preserve">129,5</w:t>
             </w:r>
           </w:p>
         </w:tc>
@@ -7463,7 +7463,7 @@
                 <w:szCs w:val="16"/>
                 <w:color w:val="000000"/>
               </w:rPr>
-              <w:t xml:space="preserve">0,0</w:t>
+              <w:t xml:space="preserve">0,7</w:t>
             </w:r>
           </w:p>
         </w:tc>
@@ -7517,7 +7517,7 @@
                 <w:szCs w:val="16"/>
                 <w:color w:val="000000"/>
               </w:rPr>
-              <w:t xml:space="preserve">2,1</w:t>
+              <w:t xml:space="preserve">10,9</w:t>
             </w:r>
           </w:p>
         </w:tc>
@@ -7631,7 +7631,7 @@
                 <w:szCs w:val="16"/>
                 <w:color w:val="000000"/>
               </w:rPr>
-              <w:t xml:space="preserve">1,461</w:t>
+              <w:t xml:space="preserve">2,468</w:t>
             </w:r>
           </w:p>
         </w:tc>
@@ -7685,7 +7685,7 @@
                 <w:szCs w:val="16"/>
                 <w:color w:val="000000"/>
               </w:rPr>
-              <w:t xml:space="preserve">119,8</w:t>
+              <w:t xml:space="preserve">114,6</w:t>
             </w:r>
           </w:p>
         </w:tc>
@@ -7739,7 +7739,7 @@
                 <w:szCs w:val="16"/>
                 <w:color w:val="000000"/>
               </w:rPr>
-              <w:t xml:space="preserve">122,2</w:t>
+              <w:t xml:space="preserve">116,0</w:t>
             </w:r>
           </w:p>
         </w:tc>
@@ -7793,7 +7793,7 @@
                 <w:szCs w:val="16"/>
                 <w:color w:val="000000"/>
               </w:rPr>
-              <w:t xml:space="preserve">122,2</w:t>
+              <w:t xml:space="preserve">116,0</w:t>
             </w:r>
           </w:p>
         </w:tc>
@@ -7847,7 +7847,7 @@
                 <w:szCs w:val="16"/>
                 <w:color w:val="000000"/>
               </w:rPr>
-              <w:t xml:space="preserve">122,8</w:t>
+              <w:t xml:space="preserve">115,8</w:t>
             </w:r>
           </w:p>
         </w:tc>
@@ -7901,7 +7901,7 @@
                 <w:szCs w:val="16"/>
                 <w:color w:val="000000"/>
               </w:rPr>
-              <w:t xml:space="preserve">122,5</w:t>
+              <w:t xml:space="preserve">116,6</w:t>
             </w:r>
           </w:p>
         </w:tc>
@@ -7955,7 +7955,7 @@
                 <w:szCs w:val="16"/>
                 <w:color w:val="000000"/>
               </w:rPr>
-              <w:t xml:space="preserve">-0,2</w:t>
+              <w:t xml:space="preserve">0,7</w:t>
             </w:r>
           </w:p>
         </w:tc>
@@ -8009,7 +8009,7 @@
                 <w:szCs w:val="16"/>
                 <w:color w:val="000000"/>
               </w:rPr>
-              <w:t xml:space="preserve">0,2</w:t>
+              <w:t xml:space="preserve">0,5</w:t>
             </w:r>
           </w:p>
         </w:tc>
@@ -8063,7 +8063,7 @@
                 <w:szCs w:val="16"/>
                 <w:color w:val="000000"/>
               </w:rPr>
-              <w:t xml:space="preserve">2,3</w:t>
+              <w:t xml:space="preserve">1,7</w:t>
             </w:r>
           </w:p>
         </w:tc>
@@ -8177,7 +8177,7 @@
                 <w:szCs w:val="16"/>
                 <w:color w:val="000000"/>
               </w:rPr>
-              <w:t xml:space="preserve">7,115</w:t>
+              <w:t xml:space="preserve">6,808</w:t>
             </w:r>
           </w:p>
         </w:tc>
@@ -8231,7 +8231,7 @@
                 <w:szCs w:val="16"/>
                 <w:color w:val="000000"/>
               </w:rPr>
-              <w:t xml:space="preserve">115,9</w:t>
+              <w:t xml:space="preserve">119,1</w:t>
             </w:r>
           </w:p>
         </w:tc>
@@ -8285,7 +8285,7 @@
                 <w:szCs w:val="16"/>
                 <w:color w:val="000000"/>
               </w:rPr>
-              <w:t xml:space="preserve">117,4</w:t>
+              <w:t xml:space="preserve">119,6</w:t>
             </w:r>
           </w:p>
         </w:tc>
@@ -8339,7 +8339,7 @@
                 <w:szCs w:val="16"/>
                 <w:color w:val="000000"/>
               </w:rPr>
-              <w:t xml:space="preserve">117,8</w:t>
+              <w:t xml:space="preserve">119,7</w:t>
             </w:r>
           </w:p>
         </w:tc>
@@ -8393,7 +8393,7 @@
                 <w:szCs w:val="16"/>
                 <w:color w:val="000000"/>
               </w:rPr>
-              <w:t xml:space="preserve">117,9</w:t>
+              <w:t xml:space="preserve">119,8</w:t>
             </w:r>
           </w:p>
         </w:tc>
@@ -8447,7 +8447,7 @@
                 <w:szCs w:val="16"/>
                 <w:color w:val="000000"/>
               </w:rPr>
-              <w:t xml:space="preserve">119,1</w:t>
+              <w:t xml:space="preserve">120,8</w:t>
             </w:r>
           </w:p>
         </w:tc>
@@ -8501,7 +8501,7 @@
                 <w:szCs w:val="16"/>
                 <w:color w:val="000000"/>
               </w:rPr>
-              <w:t xml:space="preserve">1,0</w:t>
+              <w:t xml:space="preserve">0,8</w:t>
             </w:r>
           </w:p>
         </w:tc>
@@ -8555,7 +8555,7 @@
                 <w:szCs w:val="16"/>
                 <w:color w:val="000000"/>
               </w:rPr>
-              <w:t xml:space="preserve">1,4</w:t>
+              <w:t xml:space="preserve">1,0</w:t>
             </w:r>
           </w:p>
         </w:tc>
@@ -8609,7 +8609,7 @@
                 <w:szCs w:val="16"/>
                 <w:color w:val="000000"/>
               </w:rPr>
-              <w:t xml:space="preserve">2,8</w:t>
+              <w:t xml:space="preserve">1,4</w:t>
             </w:r>
           </w:p>
         </w:tc>
@@ -8777,7 +8777,7 @@
                 <w:szCs w:val="16"/>
                 <w:color w:val="000000"/>
               </w:rPr>
-              <w:t xml:space="preserve">119,9</w:t>
+              <w:t xml:space="preserve">120,2</w:t>
             </w:r>
           </w:p>
         </w:tc>
@@ -8831,7 +8831,7 @@
                 <w:szCs w:val="16"/>
                 <w:color w:val="000000"/>
               </w:rPr>
-              <w:t xml:space="preserve">119,5</w:t>
+              <w:t xml:space="preserve">120,2</w:t>
             </w:r>
           </w:p>
         </w:tc>
@@ -8885,7 +8885,7 @@
                 <w:szCs w:val="16"/>
                 <w:color w:val="000000"/>
               </w:rPr>
-              <w:t xml:space="preserve">118,8</w:t>
+              <w:t xml:space="preserve">119,8</w:t>
             </w:r>
           </w:p>
         </w:tc>
@@ -8939,7 +8939,7 @@
                 <w:szCs w:val="16"/>
                 <w:color w:val="000000"/>
               </w:rPr>
-              <w:t xml:space="preserve">118,7</w:t>
+              <w:t xml:space="preserve">119,6</w:t>
             </w:r>
           </w:p>
         </w:tc>
@@ -8993,7 +8993,7 @@
                 <w:szCs w:val="16"/>
                 <w:color w:val="000000"/>
               </w:rPr>
-              <w:t xml:space="preserve">119,0</w:t>
+              <w:t xml:space="preserve">120,0</w:t>
             </w:r>
           </w:p>
         </w:tc>
@@ -9101,7 +9101,7 @@
                 <w:szCs w:val="16"/>
                 <w:color w:val="000000"/>
               </w:rPr>
-              <w:t xml:space="preserve">-0,4</w:t>
+              <w:t xml:space="preserve">-0,2</w:t>
             </w:r>
           </w:p>
         </w:tc>
@@ -9155,7 +9155,7 @@
                 <w:szCs w:val="16"/>
                 <w:color w:val="000000"/>
               </w:rPr>
-              <w:t xml:space="preserve">-0,8</w:t>
+              <w:t xml:space="preserve">-0,2</w:t>
             </w:r>
           </w:p>
         </w:tc>

</xml_diff>